<commit_message>
Actualizacion informe del primer avance
</commit_message>
<xml_diff>
--- a/Informe Primer Avance.docx
+++ b/Informe Primer Avance.docx
@@ -181,18 +181,7 @@
           <w:u w:val="none"/>
           <w:lang w:val="es-ES"/>
         </w:rPr>
-        <w:t>-</w:t>
-      </w:r>
-      <w:r>
-        <w:rPr>
-          <w:rFonts w:cs="Calibri" w:cstheme="minorHAnsi"/>
-          <w:color w:val="auto"/>
-          <w:sz w:val="24"/>
-          <w:szCs w:val="24"/>
-          <w:u w:val="none"/>
-          <w:lang w:val="es-ES"/>
-        </w:rPr>
-        <w:t xml:space="preserve"> Balmaceda Renzo.</w:t>
+        <w:t>- Balmaceda Renzo.</w:t>
       </w:r>
     </w:p>
     <w:p>
@@ -206,7 +195,12 @@
         </w:rPr>
       </w:pPr>
       <w:r>
-        <w:rPr/>
+        <w:rPr>
+          <w:rFonts w:cs="Calibri" w:cstheme="minorHAnsi"/>
+          <w:color w:val="auto"/>
+          <w:u w:val="single"/>
+          <w:lang w:val="es-ES"/>
+        </w:rPr>
       </w:r>
     </w:p>
     <w:p>
@@ -248,56 +242,7 @@
           <w:lang w:val="es-ES"/>
         </w:rPr>
         <w:tab/>
-        <w:t>Una vez armado el diccionario en su totalidad, creamos una lista a partir del arreglo de valores del diccionario para poder agregar un elemento en la posición 0(para que coincida con la estructura definida en la clase “</w:t>
-      </w:r>
-      <w:r>
-        <w:rPr>
-          <w:rFonts w:cs="Calibri" w:cstheme="minorHAnsi"/>
-          <w:lang w:val="es-ES"/>
-        </w:rPr>
-        <w:t>Heap</w:t>
-      </w:r>
-      <w:r>
-        <w:rPr>
-          <w:rFonts w:cs="Calibri" w:cstheme="minorHAnsi"/>
-          <w:lang w:val="es-ES"/>
-        </w:rPr>
-        <w:t xml:space="preserve">” </w:t>
-      </w:r>
-      <w:r>
-        <w:rPr>
-          <w:rFonts w:cs="Calibri" w:cstheme="minorHAnsi"/>
-          <w:lang w:val="es-ES"/>
-        </w:rPr>
-        <w:t xml:space="preserve">en el archivo </w:t>
-      </w:r>
-      <w:r>
-        <w:rPr>
-          <w:rFonts w:cs="Calibri" w:cstheme="minorHAnsi"/>
-          <w:lang w:val="es-ES"/>
-        </w:rPr>
-        <w:t>“</w:t>
-      </w:r>
-      <w:r>
-        <w:rPr>
-          <w:rFonts w:cs="Calibri" w:cstheme="minorHAnsi"/>
-          <w:lang w:val="es-ES"/>
-        </w:rPr>
-        <w:t>Algoritmos-Ordenamiento</w:t>
-      </w:r>
-      <w:r>
-        <w:rPr>
-          <w:rFonts w:cs="Calibri" w:cstheme="minorHAnsi"/>
-          <w:lang w:val="es-ES"/>
-        </w:rPr>
-        <w:t xml:space="preserve">”); </w:t>
-      </w:r>
-      <w:r>
-        <w:rPr>
-          <w:rFonts w:cs="Calibri" w:cstheme="minorHAnsi"/>
-          <w:lang w:val="es-ES"/>
-        </w:rPr>
-        <w:t>Luego convertimos la lista a un arreglo, y a partir de este creamos nuestra Heap para que sea MaxHeap. Una vez obtenida la estructura deseada pasamos a recorrer la misma y agregando la cantidad solicitada a la lista ‘collected’ utilizando un while(); luego retorna la lista.</w:t>
+        <w:t>Una vez armado el diccionario en su totalidad, creamos una lista a partir del arreglo de valores del diccionario para poder agregar un elemento en la posición 0(para que coincida con la estructura definida en la clase “Heap” en el archivo “Algoritmos-Ordenamiento”); Luego convertimos la lista a un arreglo, y a partir de este creamos nuestra Heap para que sea MaxHeap. Una vez obtenida la estructura deseada pasamos a recorrer la misma y agregando la cantidad solicitada a la lista ‘collected’ utilizando un while(); luego retorna la lista.</w:t>
       </w:r>
     </w:p>
     <w:p>
@@ -338,23 +283,27 @@
           <w:lang w:val="es-ES"/>
         </w:rPr>
         <w:tab/>
-        <w:t xml:space="preserve">Encontramos que esta implementación era ineficiente ya que separaba la lógica de &lt;palabra,ocurrencia&gt; </w:t>
-      </w:r>
-      <w:r>
-        <w:rPr>
-          <w:rFonts w:cs="Calibri" w:cstheme="minorHAnsi"/>
-          <w:lang w:val="es-ES"/>
-        </w:rPr>
-        <w:t>al ordenar solo las ocurrencias, también esto conllevaba a una ineficiencia en cuanto a Complejidad Temporal al implicar recorridos extra en todo el arreglo. También, dicha implementación presentaba riesgo de error si se daba el caso de que 2 claves tuvieran el mismo dato de ocurrencia, por lo que entregaba 2 veces el mismo elemento en vez de los 2 con el mismo dato(de ser posible).</w:t>
-      </w:r>
-    </w:p>
-    <w:p>
-      <w:pPr>
-        <w:pStyle w:val="Normal"/>
-        <w:rPr>
-          <w:rFonts w:cs="Calibri" w:cstheme="minorHAnsi"/>
-          <w:lang w:val="es-ES"/>
-        </w:rPr>
+        <w:t>Encontramos que esta implementación era ineficiente ya que separaba la lógica de &lt;palabra,ocurrencia&gt; al ordenar solo las ocurrencias, también esto conllevaba a una ineficiencia en cuanto a Complejidad Temporal al implicar recorridos extra en todo el arreglo. También, dicha implementación presentaba riesgo de error si se daba el caso de que 2 claves tuvieran el mismo dato de ocurrencia, por lo que entregaba 2 veces el mismo elemento en vez de los 2 con el mismo dato(de ser posible).</w:t>
+      </w:r>
+    </w:p>
+    <w:p>
+      <w:pPr>
+        <w:pStyle w:val="Normal"/>
+        <w:rPr/>
+      </w:pPr>
+      <w:r>
+        <w:rPr>
+          <w:rFonts w:cs="Calibri" w:cstheme="minorHAnsi"/>
+          <w:lang w:val="es-ES"/>
+        </w:rPr>
+        <w:tab/>
+        <w:t>Modificación de la clase Dato: se requirió modificar la clase Dato implementando la interfaz iComparable. Esto fue un requisito estricto de las estructuras de ordenamiento Heap y MergeSort, ya que necesitan que los objetos sepan compararse entre sí mediante su atributo de ocurrencia para poder organizarlos jerarquicamente. El uso del diccionario es independiente de esta modificación</w:t>
+      </w:r>
+    </w:p>
+    <w:p>
+      <w:pPr>
+        <w:pStyle w:val="Normal"/>
+        <w:rPr/>
       </w:pPr>
       <w:r>
         <w:rPr>
@@ -427,31 +376,7 @@
         <w:rPr>
           <w:rFonts w:cs="Calibri" w:cstheme="minorHAnsi"/>
         </w:rPr>
-        <w:t>Al terminar el recorrido de la lista, convertimos los valores del diccionario en un arreglo. Para luego crear un objeto de la clase Ordenamiento&lt;Dato&gt; y llamar al método MergeSort</w:t>
-      </w:r>
-      <w:r>
-        <w:rPr>
-          <w:rFonts w:cs="Calibri" w:cstheme="minorHAnsi"/>
-        </w:rPr>
-        <w:t>()</w:t>
-      </w:r>
-      <w:r>
-        <w:rPr>
-          <w:rFonts w:cs="Calibri" w:cstheme="minorHAnsi"/>
-        </w:rPr>
-        <w:t>, el cual divide el arreglo en dos mitades, ordena de forma recursiva cada parte y finalmente une a ambas. Una vez ordenado, calculo el límite y aplicamos Math.Min que evita ingresar a posiciones q</w:t>
-      </w:r>
-      <w:r>
-        <w:rPr>
-          <w:rFonts w:cs="Calibri" w:cstheme="minorHAnsi"/>
-        </w:rPr>
-        <w:t>ue</w:t>
-      </w:r>
-      <w:r>
-        <w:rPr>
-          <w:rFonts w:cs="Calibri" w:cstheme="minorHAnsi"/>
-        </w:rPr>
-        <w:t xml:space="preserve"> no existen si la cantidad solicitada es mayor a la del arreglo.</w:t>
+        <w:t>Al terminar el recorrido de la lista, convertimos los valores del diccionario en un arreglo. Para luego crear un objeto de la clase Ordenamiento&lt;Dato&gt; y llamar al método MergeSort(), el cual divide el arreglo en dos mitades, ordena de forma recursiva cada parte y finalmente une a ambas. Una vez ordenado, calculo el límite y aplicamos Math.Min que evita ingresar a posiciones que no existen si la cantidad solicitada es mayor a la del arreglo.</w:t>
       </w:r>
     </w:p>
     <w:p>
@@ -504,7 +429,6 @@
       <w:rPr>
         <w:rFonts w:ascii="Calibri" w:hAnsi="Calibri" w:eastAsia="Calibri" w:cs="" w:asciiTheme="minorHAnsi" w:cstheme="minorBidi" w:eastAsiaTheme="minorHAnsi" w:hAnsiTheme="minorHAnsi"/>
         <w:kern w:val="2"/>
-        <w:sz w:val="24"/>
         <w:szCs w:val="24"/>
         <w:lang w:val="es-AR" w:eastAsia="en-US" w:bidi="ar-SA"/>
         <w14:ligatures w14:val="standardContextual"/>

</xml_diff>